<commit_message>
fix(pitch): align General script price + tier to site source-of-truth
- Swap "Two hundred a month" → "One ninety-nine a month" in 2min + 5min
  (site checkout shows $199/mo with tutor — closes spoken/checkout gap)
- Remove "WhatsApp scenarios" from 5min General tier description
  (those drills live in the +$29 AI Practice Bot add-on, not General)
- Add EDITS-2026-04-24.md as audit trail

Co-Authored-By: Claude Opus 4.7 (1M context) <noreply@anthropic.com>
</commit_message>
<xml_diff>
--- a/marketing/pitch-scripts/elevare-pitch-general-5min.docx
+++ b/marketing/pitch-scripts/elevare-pitch-general-5min.docx
@@ -368,19 +368,19 @@
       </w:pPr>
       <w:r>
         <w:rPr/>
-        <w:t>Ninety-nine dollars a month, self-serve — groups + AI facilitator + WhatsApp scenarios.</w:t>
-      </w:r>
-    </w:p>
-    <w:p>
-      <w:pPr>
-        <w:pStyle w:val="BodyText"/>
-        <w:bidi w:val="0"/>
-        <w:jc w:val="left"/>
-        <w:rPr/>
-      </w:pPr>
-      <w:r>
-        <w:rPr/>
-        <w:t>Two hundred a month if you want a human tutor dropping into your group session each week.</w:t>
+        <w:t>Ninety-nine dollars a month, self-serve — small groups + AI facilitator + named feedback after every session.</w:t>
+      </w:r>
+    </w:p>
+    <w:p>
+      <w:pPr>
+        <w:pStyle w:val="BodyText"/>
+        <w:bidi w:val="0"/>
+        <w:jc w:val="left"/>
+        <w:rPr/>
+      </w:pPr>
+      <w:r>
+        <w:rPr/>
+        <w:t>One ninety-nine a month if you want a human tutor dropping into your group session each week.</w:t>
       </w:r>
     </w:p>
     <w:p>

</xml_diff>